<commit_message>
DAMA 2026: Ollama API stub, test_ollama harness, streaming support, G1 output-leak and G2 task-origin fixes
</commit_message>
<xml_diff>
--- a/docs/Four-Gateways-Setup-Guide.docx
+++ b/docs/Four-Gateways-Setup-Guide.docx
@@ -922,6 +922,34 @@
     </w:p>
     <w:p>
       <w:pPr>
+        <w:pStyle w:val="ListBullet"/>
+      </w:pPr>
+      <w:r>
+        <w:rPr>
+          <w:b/>
+        </w:rPr>
+        <w:t xml:space="preserve">Test the Ollama path without downloading a model: </w:t>
+      </w:r>
+      <w:r>
+        <w:t>python3 tests/test_ollama.py starts a small stand-in for the Ollama API and runs every lab as llama3.1:8b and deepseek-r1:7b, including a "bad" model that obeys the injection, invents numbers, and echoes an SSN. All gates should still pass. Add --real llama3.1:8b to also run against your real Ollama. With make installed: make test-ollama.</w:t>
+      </w:r>
+    </w:p>
+    <w:p>
+      <w:pPr>
+        <w:pStyle w:val="ListBullet"/>
+      </w:pPr>
+      <w:r>
+        <w:rPr>
+          <w:b/>
+        </w:rPr>
+        <w:t xml:space="preserve">A small model gives odd answers: </w:t>
+      </w:r>
+      <w:r>
+        <w:t>Expected. The gates decide the outcome, not the model. A model that forgets to cite sources gets its sentences removed by G3, which is the gate working.</w:t>
+      </w:r>
+    </w:p>
+    <w:p>
+      <w:pPr>
         <w:pStyle w:val="Heading1"/>
       </w:pPr>
       <w:r>

</xml_diff>